<commit_message>
Resume: add Linux kernel contribution, rebuild all formats
Rebuilt from jeremycochoy/resume branch cv-linux-kernel
(jeremycochoy/resume#1) with `make clean && make` (pandoc 2.7.3,
ConTeXt MkIV on LuaTeX):

- New first "Open Source Contributions" entry: Linux kernel, ext2
  patch 92e128884bf0 merged in Linux 2.6.33.
- index.pdf, index.txt and index.docx were still the 2022 build. They
  now also include the April 2026 entries (Redstone Solutions OÜ,
  ML Consulting).
- index.md: age filled in (36) by the Makefile. index.html keeps the
  {{ MYAGE }} placeholder that age.js replaces in the browser.
- index.tex, index.tuc, index.log: ConTeXt files from this build.

Co-Authored-By: Claude Opus 5.5 <noreply@anthropic.com>
</commit_message>
<xml_diff>
--- a/resume/index.docx
+++ b/resume/index.docx
@@ -56,6 +56,72 @@
         <w:pStyle w:val="DefinitionTerm"/>
       </w:pPr>
       <w:r>
+        <w:t xml:space="preserve">2021-Today</w:t>
+      </w:r>
+    </w:p>
+    <w:p>
+      <w:pPr>
+        <w:pStyle w:val="Definition"/>
+      </w:pPr>
+      <w:r>
+        <w:rPr>
+          <w:i/>
+        </w:rPr>
+        <w:t xml:space="preserve">CEO at Redstone Solutions OÜ</w:t>
+      </w:r>
+    </w:p>
+    <w:p>
+      <w:pPr>
+        <w:pStyle w:val="Definition"/>
+      </w:pPr>
+      <w:r>
+        <w:t xml:space="preserve">Real-time and high-availability solutions. Building advanced generative modeling and simulation technologies.</w:t>
+      </w:r>
+    </w:p>
+    <w:p>
+      <w:pPr>
+        <w:pStyle w:val="DefinitionTerm"/>
+      </w:pPr>
+      <w:r>
+        <w:t xml:space="preserve">2020-2021</w:t>
+      </w:r>
+    </w:p>
+    <w:p>
+      <w:pPr>
+        <w:pStyle w:val="Definition"/>
+      </w:pPr>
+      <w:r>
+        <w:rPr>
+          <w:i/>
+        </w:rPr>
+        <w:t xml:space="preserve">ML Consulting</w:t>
+      </w:r>
+    </w:p>
+    <w:p>
+      <w:pPr>
+        <w:pStyle w:val="Definition"/>
+      </w:pPr>
+      <w:r>
+        <w:t xml:space="preserve">Providing machine learning consulting services with a focus on time series forecasting.</w:t>
+      </w:r>
+      <w:r>
+        <w:t xml:space="preserve"> </w:t>
+      </w:r>
+      <w:r>
+        <w:t xml:space="preserve">Expertise includes designing and implementing predictive models using PyTorch, transformers,</w:t>
+      </w:r>
+      <w:r>
+        <w:t xml:space="preserve"> </w:t>
+      </w:r>
+      <w:r>
+        <w:t xml:space="preserve">and recurrent neural network architectures.</w:t>
+      </w:r>
+    </w:p>
+    <w:p>
+      <w:pPr>
+        <w:pStyle w:val="DefinitionTerm"/>
+      </w:pPr>
+      <w:r>
         <w:t xml:space="preserve">2019-2020</w:t>
       </w:r>
     </w:p>
@@ -478,6 +544,43 @@
         <w:pStyle w:val="DefinitionTerm"/>
       </w:pPr>
       <w:r>
+        <w:t xml:space="preserve">Linux kernel</w:t>
+      </w:r>
+    </w:p>
+    <w:p>
+      <w:pPr>
+        <w:pStyle w:val="Compact"/>
+        <w:pStyle w:val="Definition"/>
+      </w:pPr>
+      <w:r>
+        <w:t xml:space="preserve">Contributor to the ext2 filesystem</w:t>
+      </w:r>
+      <w:r>
+        <w:t xml:space="preserve"> </w:t>
+      </w:r>
+      <w:r>
+        <w:t xml:space="preserve">(</w:t>
+      </w:r>
+      <w:hyperlink r:id="rId23">
+        <w:r>
+          <w:rPr>
+            <w:rStyle w:val="Hyperlink"/>
+          </w:rPr>
+          <w:t xml:space="preserve">patch</w:t>
+        </w:r>
+      </w:hyperlink>
+      <w:r>
+        <w:t xml:space="preserve"> </w:t>
+      </w:r>
+      <w:r>
+        <w:t xml:space="preserve">merged in Linux 2.6.33).</w:t>
+      </w:r>
+    </w:p>
+    <w:p>
+      <w:pPr>
+        <w:pStyle w:val="DefinitionTerm"/>
+      </w:pPr>
+      <w:r>
         <w:t xml:space="preserve">C++</w:t>
       </w:r>
     </w:p>
@@ -492,7 +595,7 @@
       <w:r>
         <w:t xml:space="preserve"> </w:t>
       </w:r>
-      <w:hyperlink r:id="rId23">
+      <w:hyperlink r:id="rId24">
         <w:r>
           <w:rPr>
             <w:rStyle w:val="Hyperlink"/>
@@ -529,7 +632,7 @@
       <w:r>
         <w:t xml:space="preserve"> </w:t>
       </w:r>
-      <w:hyperlink r:id="rId24">
+      <w:hyperlink r:id="rId25">
         <w:r>
           <w:rPr>
             <w:rStyle w:val="Hyperlink"/>
@@ -551,11 +654,11 @@
       <w:pPr>
         <w:pStyle w:val="Heading2"/>
       </w:pPr>
-      <w:bookmarkStart w:id="25" w:name="techs-and-stacks"/>
+      <w:bookmarkStart w:id="26" w:name="techs-and-stacks"/>
       <w:r>
         <w:t xml:space="preserve">Techs and Stacks</w:t>
       </w:r>
-      <w:bookmarkEnd w:id="25"/>
+      <w:bookmarkEnd w:id="26"/>
     </w:p>
     <w:p>
       <w:pPr>
@@ -633,11 +736,11 @@
       <w:pPr>
         <w:pStyle w:val="Heading2"/>
       </w:pPr>
-      <w:bookmarkStart w:id="26" w:name="activities-and-interests"/>
+      <w:bookmarkStart w:id="27" w:name="activities-and-interests"/>
       <w:r>
         <w:t xml:space="preserve">Activities and interests</w:t>
       </w:r>
-      <w:bookmarkEnd w:id="26"/>
+      <w:bookmarkEnd w:id="27"/>
     </w:p>
     <w:p>
       <w:pPr>
@@ -685,7 +788,7 @@
         <w:pStyle w:val="BlockText"/>
       </w:pPr>
       <w:r>
-        <w:t xml:space="preserve">jeremy.cochoy@gmail.com • +33 6 43 01 74 02 • years old</w:t>
+        <w:t xml:space="preserve">jeremy.cochoy@gmail.com • +33 6 43 01 74 02 • 36 years old</w:t>
       </w:r>
       <w:r>
         <w:br/>
@@ -702,7 +805,7 @@
       <w:r>
         <w:br/>
       </w:r>
-      <w:hyperlink r:id="rId27">
+      <w:hyperlink r:id="rId28">
         <w:r>
           <w:rPr>
             <w:rStyle w:val="Hyperlink"/>
@@ -719,7 +822,7 @@
       <w:r>
         <w:t xml:space="preserve"> </w:t>
       </w:r>
-      <w:hyperlink r:id="rId28">
+      <w:hyperlink r:id="rId29">
         <w:r>
           <w:rPr>
             <w:rStyle w:val="Hyperlink"/>
@@ -736,7 +839,7 @@
       <w:r>
         <w:t xml:space="preserve"> </w:t>
       </w:r>
-      <w:hyperlink r:id="rId29">
+      <w:hyperlink r:id="rId30">
         <w:r>
           <w:rPr>
             <w:rStyle w:val="Hyperlink"/>
@@ -753,7 +856,7 @@
       <w:r>
         <w:t xml:space="preserve"> </w:t>
       </w:r>
-      <w:hyperlink r:id="rId30">
+      <w:hyperlink r:id="rId31">
         <w:r>
           <w:rPr>
             <w:rStyle w:val="Hyperlink"/>

</xml_diff>

<commit_message>
new version Sun Oct 25 14:11:15 CET 2026
</commit_message>
<xml_diff>
--- a/resume/index.docx
+++ b/resume/index.docx
@@ -56,6 +56,72 @@
         <w:pStyle w:val="DefinitionTerm"/>
       </w:pPr>
       <w:r>
+        <w:t xml:space="preserve">2021-Today</w:t>
+      </w:r>
+    </w:p>
+    <w:p>
+      <w:pPr>
+        <w:pStyle w:val="Definition"/>
+      </w:pPr>
+      <w:r>
+        <w:rPr>
+          <w:i/>
+        </w:rPr>
+        <w:t xml:space="preserve">CEO at Redstone Solutions OÜ</w:t>
+      </w:r>
+    </w:p>
+    <w:p>
+      <w:pPr>
+        <w:pStyle w:val="Definition"/>
+      </w:pPr>
+      <w:r>
+        <w:t xml:space="preserve">Real-time and high-availability solutions. Building advanced generative modeling and simulation technologies.</w:t>
+      </w:r>
+    </w:p>
+    <w:p>
+      <w:pPr>
+        <w:pStyle w:val="DefinitionTerm"/>
+      </w:pPr>
+      <w:r>
+        <w:t xml:space="preserve">2020-2021</w:t>
+      </w:r>
+    </w:p>
+    <w:p>
+      <w:pPr>
+        <w:pStyle w:val="Definition"/>
+      </w:pPr>
+      <w:r>
+        <w:rPr>
+          <w:i/>
+        </w:rPr>
+        <w:t xml:space="preserve">ML Consulting</w:t>
+      </w:r>
+    </w:p>
+    <w:p>
+      <w:pPr>
+        <w:pStyle w:val="Definition"/>
+      </w:pPr>
+      <w:r>
+        <w:t xml:space="preserve">Providing machine learning consulting services with a focus on time series forecasting.</w:t>
+      </w:r>
+      <w:r>
+        <w:t xml:space="preserve"> </w:t>
+      </w:r>
+      <w:r>
+        <w:t xml:space="preserve">Expertise includes designing and implementing predictive models using PyTorch, transformers,</w:t>
+      </w:r>
+      <w:r>
+        <w:t xml:space="preserve"> </w:t>
+      </w:r>
+      <w:r>
+        <w:t xml:space="preserve">and recurrent neural network architectures.</w:t>
+      </w:r>
+    </w:p>
+    <w:p>
+      <w:pPr>
+        <w:pStyle w:val="DefinitionTerm"/>
+      </w:pPr>
+      <w:r>
         <w:t xml:space="preserve">2019-2020</w:t>
       </w:r>
     </w:p>
@@ -478,6 +544,43 @@
         <w:pStyle w:val="DefinitionTerm"/>
       </w:pPr>
       <w:r>
+        <w:t xml:space="preserve">Linux kernel</w:t>
+      </w:r>
+    </w:p>
+    <w:p>
+      <w:pPr>
+        <w:pStyle w:val="Compact"/>
+        <w:pStyle w:val="Definition"/>
+      </w:pPr>
+      <w:r>
+        <w:t xml:space="preserve">Contributor to the ext2 filesystem</w:t>
+      </w:r>
+      <w:r>
+        <w:t xml:space="preserve"> </w:t>
+      </w:r>
+      <w:r>
+        <w:t xml:space="preserve">(</w:t>
+      </w:r>
+      <w:hyperlink r:id="rId23">
+        <w:r>
+          <w:rPr>
+            <w:rStyle w:val="Hyperlink"/>
+          </w:rPr>
+          <w:t xml:space="preserve">patch</w:t>
+        </w:r>
+      </w:hyperlink>
+      <w:r>
+        <w:t xml:space="preserve"> </w:t>
+      </w:r>
+      <w:r>
+        <w:t xml:space="preserve">merged in Linux 2.6.33).</w:t>
+      </w:r>
+    </w:p>
+    <w:p>
+      <w:pPr>
+        <w:pStyle w:val="DefinitionTerm"/>
+      </w:pPr>
+      <w:r>
         <w:t xml:space="preserve">C++</w:t>
       </w:r>
     </w:p>
@@ -492,7 +595,7 @@
       <w:r>
         <w:t xml:space="preserve"> </w:t>
       </w:r>
-      <w:hyperlink r:id="rId23">
+      <w:hyperlink r:id="rId24">
         <w:r>
           <w:rPr>
             <w:rStyle w:val="Hyperlink"/>
@@ -529,7 +632,7 @@
       <w:r>
         <w:t xml:space="preserve"> </w:t>
       </w:r>
-      <w:hyperlink r:id="rId24">
+      <w:hyperlink r:id="rId25">
         <w:r>
           <w:rPr>
             <w:rStyle w:val="Hyperlink"/>
@@ -551,11 +654,11 @@
       <w:pPr>
         <w:pStyle w:val="Heading2"/>
       </w:pPr>
-      <w:bookmarkStart w:id="25" w:name="techs-and-stacks"/>
+      <w:bookmarkStart w:id="26" w:name="techs-and-stacks"/>
       <w:r>
         <w:t xml:space="preserve">Techs and Stacks</w:t>
       </w:r>
-      <w:bookmarkEnd w:id="25"/>
+      <w:bookmarkEnd w:id="26"/>
     </w:p>
     <w:p>
       <w:pPr>
@@ -633,11 +736,11 @@
       <w:pPr>
         <w:pStyle w:val="Heading2"/>
       </w:pPr>
-      <w:bookmarkStart w:id="26" w:name="activities-and-interests"/>
+      <w:bookmarkStart w:id="27" w:name="activities-and-interests"/>
       <w:r>
         <w:t xml:space="preserve">Activities and interests</w:t>
       </w:r>
-      <w:bookmarkEnd w:id="26"/>
+      <w:bookmarkEnd w:id="27"/>
     </w:p>
     <w:p>
       <w:pPr>
@@ -685,7 +788,7 @@
         <w:pStyle w:val="BlockText"/>
       </w:pPr>
       <w:r>
-        <w:t xml:space="preserve">jeremy.cochoy@gmail.com • +33 6 43 01 74 02 • years old</w:t>
+        <w:t xml:space="preserve">jeremy.cochoy@gmail.com • +33 6 43 01 74 02 • 36 years old</w:t>
       </w:r>
       <w:r>
         <w:br/>
@@ -702,7 +805,7 @@
       <w:r>
         <w:br/>
       </w:r>
-      <w:hyperlink r:id="rId27">
+      <w:hyperlink r:id="rId28">
         <w:r>
           <w:rPr>
             <w:rStyle w:val="Hyperlink"/>
@@ -719,7 +822,7 @@
       <w:r>
         <w:t xml:space="preserve"> </w:t>
       </w:r>
-      <w:hyperlink r:id="rId28">
+      <w:hyperlink r:id="rId29">
         <w:r>
           <w:rPr>
             <w:rStyle w:val="Hyperlink"/>
@@ -736,7 +839,7 @@
       <w:r>
         <w:t xml:space="preserve"> </w:t>
       </w:r>
-      <w:hyperlink r:id="rId29">
+      <w:hyperlink r:id="rId30">
         <w:r>
           <w:rPr>
             <w:rStyle w:val="Hyperlink"/>
@@ -753,7 +856,7 @@
       <w:r>
         <w:t xml:space="preserve"> </w:t>
       </w:r>
-      <w:hyperlink r:id="rId30">
+      <w:hyperlink r:id="rId31">
         <w:r>
           <w:rPr>
             <w:rStyle w:val="Hyperlink"/>

</xml_diff>